<commit_message>
Actualizacion evidencias repositorio GitHub
</commit_message>
<xml_diff>
--- a/Serie 05-parcial2-estacionamiento/Serie-05-parcial2-estacionamiento/evidencias/evidenciasexamenparcial2.docx
+++ b/Serie 05-parcial2-estacionamiento/Serie-05-parcial2-estacionamiento/evidencias/evidenciasexamenparcial2.docx
@@ -1373,7 +1373,7 @@
           <w:lang w:val="es-ES"/>
         </w:rPr>
         <w:drawing>
-          <wp:inline distT="0" distB="0" distL="0" distR="0" wp14:anchorId="55A036FD" wp14:editId="51571AD6">
+          <wp:inline distT="0" distB="0" distL="0" distR="0" wp14:anchorId="55A036FD" wp14:editId="67AA6622">
             <wp:extent cx="5611495" cy="2955925"/>
             <wp:effectExtent l="0" t="0" r="8255" b="0"/>
             <wp:docPr id="128223076" name="Imagen 43"/>
@@ -2005,6 +2005,142 @@
         <w:lastRenderedPageBreak/>
         <w:t>Evidencias GitHub</w:t>
       </w:r>
+    </w:p>
+    <w:p>
+      <w:pPr>
+        <w:rPr>
+          <w:sz w:val="28"/>
+          <w:szCs w:val="28"/>
+          <w:lang w:val="es-ES"/>
+        </w:rPr>
+      </w:pPr>
+      <w:r>
+        <w:rPr>
+          <w:sz w:val="28"/>
+          <w:szCs w:val="28"/>
+          <w:lang w:val="es-ES"/>
+        </w:rPr>
+        <w:t>Repositorio GitHub</w:t>
+      </w:r>
+      <w:r>
+        <w:rPr>
+          <w:sz w:val="28"/>
+          <w:szCs w:val="28"/>
+          <w:lang w:val="es-ES"/>
+        </w:rPr>
+        <w:t>:</w:t>
+      </w:r>
+    </w:p>
+    <w:p>
+      <w:pPr>
+        <w:rPr>
+          <w:sz w:val="24"/>
+          <w:szCs w:val="24"/>
+          <w:lang w:val="es-ES"/>
+        </w:rPr>
+      </w:pPr>
+      <w:hyperlink r:id="rId26" w:history="1">
+        <w:r>
+          <w:rPr>
+            <w:rStyle w:val="Hipervnculo"/>
+            <w:sz w:val="24"/>
+            <w:szCs w:val="24"/>
+            <w:lang w:val="es-ES"/>
+          </w:rPr>
+          <w:t>https://github.com/DYLANG187/programacion-II-2026/tree/main/Serie%2005-parcial2-estacionamiento/Serie-05-parcial2-estacionamiento</w:t>
+        </w:r>
+      </w:hyperlink>
+    </w:p>
+    <w:p>
+      <w:pPr>
+        <w:rPr>
+          <w:sz w:val="24"/>
+          <w:szCs w:val="24"/>
+          <w:lang w:val="es-ES"/>
+        </w:rPr>
+      </w:pPr>
+      <w:r>
+        <w:rPr>
+          <w:noProof/>
+          <w:sz w:val="24"/>
+          <w:szCs w:val="24"/>
+          <w:lang w:val="es-ES"/>
+        </w:rPr>
+        <w:drawing>
+          <wp:anchor distT="0" distB="0" distL="114300" distR="114300" simplePos="0" relativeHeight="251668480" behindDoc="0" locked="0" layoutInCell="1" allowOverlap="1" wp14:anchorId="78D4DA89" wp14:editId="41FED126">
+            <wp:simplePos x="0" y="0"/>
+            <wp:positionH relativeFrom="page">
+              <wp:align>center</wp:align>
+            </wp:positionH>
+            <wp:positionV relativeFrom="paragraph">
+              <wp:posOffset>317157</wp:posOffset>
+            </wp:positionV>
+            <wp:extent cx="7106013" cy="3113903"/>
+            <wp:effectExtent l="0" t="0" r="0" b="0"/>
+            <wp:wrapThrough wrapText="bothSides">
+              <wp:wrapPolygon edited="0">
+                <wp:start x="0" y="0"/>
+                <wp:lineTo x="0" y="21411"/>
+                <wp:lineTo x="21542" y="21411"/>
+                <wp:lineTo x="21542" y="0"/>
+                <wp:lineTo x="0" y="0"/>
+              </wp:wrapPolygon>
+            </wp:wrapThrough>
+            <wp:docPr id="229543119" name="Imagen 1"/>
+            <wp:cNvGraphicFramePr>
+              <a:graphicFrameLocks xmlns:a="http://schemas.openxmlformats.org/drawingml/2006/main" noChangeAspect="1"/>
+            </wp:cNvGraphicFramePr>
+            <a:graphic xmlns:a="http://schemas.openxmlformats.org/drawingml/2006/main">
+              <a:graphicData uri="http://schemas.openxmlformats.org/drawingml/2006/picture">
+                <pic:pic xmlns:pic="http://schemas.openxmlformats.org/drawingml/2006/picture">
+                  <pic:nvPicPr>
+                    <pic:cNvPr id="229543119" name="Imagen 229543119"/>
+                    <pic:cNvPicPr/>
+                  </pic:nvPicPr>
+                  <pic:blipFill>
+                    <a:blip r:embed="rId27">
+                      <a:extLst>
+                        <a:ext uri="{28A0092B-C50C-407E-A947-70E740481C1C}">
+                          <a14:useLocalDpi xmlns:a14="http://schemas.microsoft.com/office/drawing/2010/main" val="0"/>
+                        </a:ext>
+                      </a:extLst>
+                    </a:blip>
+                    <a:stretch>
+                      <a:fillRect/>
+                    </a:stretch>
+                  </pic:blipFill>
+                  <pic:spPr>
+                    <a:xfrm>
+                      <a:off x="0" y="0"/>
+                      <a:ext cx="7106013" cy="3113903"/>
+                    </a:xfrm>
+                    <a:prstGeom prst="rect">
+                      <a:avLst/>
+                    </a:prstGeom>
+                  </pic:spPr>
+                </pic:pic>
+              </a:graphicData>
+            </a:graphic>
+          </wp:anchor>
+        </w:drawing>
+      </w:r>
+      <w:r>
+        <w:rPr>
+          <w:sz w:val="24"/>
+          <w:szCs w:val="24"/>
+          <w:lang w:val="es-ES"/>
+        </w:rPr>
+        <w:t>Estructura:</w:t>
+      </w:r>
+    </w:p>
+    <w:p>
+      <w:pPr>
+        <w:rPr>
+          <w:sz w:val="24"/>
+          <w:szCs w:val="24"/>
+          <w:lang w:val="es-ES"/>
+        </w:rPr>
+      </w:pPr>
     </w:p>
     <w:p>
       <w:pPr>

</xml_diff>